<commit_message>
Add team names and course section to documents
</commit_message>
<xml_diff>
--- a/Modular_Program_Hierarchy.docx
+++ b/Modular_Program_Hierarchy.docx
@@ -9,6 +9,26 @@
       </w:pPr>
       <w:r>
         <w:t xml:space="preserve">Modular Program Hierarchy</w:t>
+      </w:r>
+    </w:p>
+    <w:p>
+      <w:pPr>
+        <w:spacing w:after="40"/>
+      </w:pPr>
+      <w:r>
+        <w:rPr>
+          <w:b/>
+          <w:bCs/>
+        </w:rPr>
+        <w:t xml:space="preserve">Justin Pence, Sammy Kahingo, Asim Adam, Rohit Kumar</w:t>
+      </w:r>
+    </w:p>
+    <w:p>
+      <w:pPr>
+        <w:spacing w:after="120"/>
+      </w:pPr>
+      <w:r>
+        <w:t xml:space="preserve">IT 106 - DL1</w:t>
       </w:r>
     </w:p>
     <w:p>

</xml_diff>